<commit_message>
commit de ejercicios de DAW
</commit_message>
<xml_diff>
--- a/2ºDAW/DAW/2ºTrimestre/Unidad 4/Ejercicios/actividad4.3-SuárezGarcíaPablo.docx
+++ b/2ºDAW/DAW/2ºTrimestre/Unidad 4/Ejercicios/actividad4.3-SuárezGarcíaPablo.docx
@@ -746,6 +746,48 @@
     </w:p>
     <w:p>
       <w:r>
+        <w:rPr>
+          <w:noProof/>
+        </w:rPr>
+        <w:drawing>
+          <wp:inline distT="0" distB="0" distL="0" distR="0" wp14:anchorId="6789A97C" wp14:editId="439B1184">
+            <wp:extent cx="5400040" cy="135890"/>
+            <wp:effectExtent l="0" t="0" r="0" b="0"/>
+            <wp:docPr id="6" name="Imagen 6"/>
+            <wp:cNvGraphicFramePr>
+              <a:graphicFrameLocks xmlns:a="http://schemas.openxmlformats.org/drawingml/2006/main" noChangeAspect="1"/>
+            </wp:cNvGraphicFramePr>
+            <a:graphic xmlns:a="http://schemas.openxmlformats.org/drawingml/2006/main">
+              <a:graphicData uri="http://schemas.openxmlformats.org/drawingml/2006/picture">
+                <pic:pic xmlns:pic="http://schemas.openxmlformats.org/drawingml/2006/picture">
+                  <pic:nvPicPr>
+                    <pic:cNvPr id="1" name=""/>
+                    <pic:cNvPicPr/>
+                  </pic:nvPicPr>
+                  <pic:blipFill>
+                    <a:blip r:embed="rId11"/>
+                    <a:stretch>
+                      <a:fillRect/>
+                    </a:stretch>
+                  </pic:blipFill>
+                  <pic:spPr>
+                    <a:xfrm>
+                      <a:off x="0" y="0"/>
+                      <a:ext cx="5400040" cy="135890"/>
+                    </a:xfrm>
+                    <a:prstGeom prst="rect">
+                      <a:avLst/>
+                    </a:prstGeom>
+                  </pic:spPr>
+                </pic:pic>
+              </a:graphicData>
+            </a:graphic>
+          </wp:inline>
+        </w:drawing>
+      </w:r>
+    </w:p>
+    <w:p>
+      <w:r>
         <w:t>Es importante destacar que el fichero de contraseñas NO DEBE estar en la misma carpeta que las páginas web (por si alguien remotamente puede hacerse con él).</w:t>
       </w:r>
     </w:p>
@@ -754,14 +796,97 @@
         <w:t>Cuando se ponga en el navegador la dirección de la web, se pedirá nombre de usuario y contraseña, como se ha visto anteriormente:</w:t>
       </w:r>
     </w:p>
+    <w:p>
+      <w:r>
+        <w:rPr>
+          <w:noProof/>
+        </w:rPr>
+        <w:drawing>
+          <wp:inline distT="0" distB="0" distL="0" distR="0" wp14:anchorId="6CE0B89C" wp14:editId="041723AC">
+            <wp:extent cx="4066667" cy="3342857"/>
+            <wp:effectExtent l="0" t="0" r="0" b="0"/>
+            <wp:docPr id="4" name="Imagen 4"/>
+            <wp:cNvGraphicFramePr>
+              <a:graphicFrameLocks xmlns:a="http://schemas.openxmlformats.org/drawingml/2006/main" noChangeAspect="1"/>
+            </wp:cNvGraphicFramePr>
+            <a:graphic xmlns:a="http://schemas.openxmlformats.org/drawingml/2006/main">
+              <a:graphicData uri="http://schemas.openxmlformats.org/drawingml/2006/picture">
+                <pic:pic xmlns:pic="http://schemas.openxmlformats.org/drawingml/2006/picture">
+                  <pic:nvPicPr>
+                    <pic:cNvPr id="1" name=""/>
+                    <pic:cNvPicPr/>
+                  </pic:nvPicPr>
+                  <pic:blipFill>
+                    <a:blip r:embed="rId12"/>
+                    <a:stretch>
+                      <a:fillRect/>
+                    </a:stretch>
+                  </pic:blipFill>
+                  <pic:spPr>
+                    <a:xfrm>
+                      <a:off x="0" y="0"/>
+                      <a:ext cx="4066667" cy="3342857"/>
+                    </a:xfrm>
+                    <a:prstGeom prst="rect">
+                      <a:avLst/>
+                    </a:prstGeom>
+                  </pic:spPr>
+                </pic:pic>
+              </a:graphicData>
+            </a:graphic>
+          </wp:inline>
+        </w:drawing>
+      </w:r>
+    </w:p>
+    <w:p>
+      <w:r>
+        <w:t>Al dar nombre de usuario y contraseña correctos, podemos entrar en la web</w:t>
+      </w:r>
+    </w:p>
+    <w:p>
+      <w:r>
+        <w:rPr>
+          <w:noProof/>
+        </w:rPr>
+        <w:drawing>
+          <wp:inline distT="0" distB="0" distL="0" distR="0" wp14:anchorId="12A943DE" wp14:editId="029D5725">
+            <wp:extent cx="3800000" cy="1247619"/>
+            <wp:effectExtent l="0" t="0" r="0" b="0"/>
+            <wp:docPr id="5" name="Imagen 5"/>
+            <wp:cNvGraphicFramePr>
+              <a:graphicFrameLocks xmlns:a="http://schemas.openxmlformats.org/drawingml/2006/main" noChangeAspect="1"/>
+            </wp:cNvGraphicFramePr>
+            <a:graphic xmlns:a="http://schemas.openxmlformats.org/drawingml/2006/main">
+              <a:graphicData uri="http://schemas.openxmlformats.org/drawingml/2006/picture">
+                <pic:pic xmlns:pic="http://schemas.openxmlformats.org/drawingml/2006/picture">
+                  <pic:nvPicPr>
+                    <pic:cNvPr id="1" name=""/>
+                    <pic:cNvPicPr/>
+                  </pic:nvPicPr>
+                  <pic:blipFill>
+                    <a:blip r:embed="rId13"/>
+                    <a:stretch>
+                      <a:fillRect/>
+                    </a:stretch>
+                  </pic:blipFill>
+                  <pic:spPr>
+                    <a:xfrm>
+                      <a:off x="0" y="0"/>
+                      <a:ext cx="3800000" cy="1247619"/>
+                    </a:xfrm>
+                    <a:prstGeom prst="rect">
+                      <a:avLst/>
+                    </a:prstGeom>
+                  </pic:spPr>
+                </pic:pic>
+              </a:graphicData>
+            </a:graphic>
+          </wp:inline>
+        </w:drawing>
+      </w:r>
+    </w:p>
     <w:p/>
     <w:p>
-      <w:r>
-        <w:t>Al dar nombre de usuario y contraseña correctos, podemos entrar en la web</w:t>
-      </w:r>
-    </w:p>
-    <w:p/>
-    <w:p>
       <w:pPr>
         <w:pStyle w:val="Ttulo2"/>
       </w:pPr>
@@ -810,13 +935,55 @@
     </w:p>
     <w:p>
       <w:r>
+        <w:lastRenderedPageBreak/>
         <w:t>1.- Editamos sus directivas y ponemos esta información exactamente, borrando lo que no aparezca aquí:</w:t>
       </w:r>
       <w:r>
         <w:t xml:space="preserve"> </w:t>
       </w:r>
     </w:p>
-    <w:p/>
+    <w:p>
+      <w:r>
+        <w:rPr>
+          <w:noProof/>
+        </w:rPr>
+        <w:drawing>
+          <wp:inline distT="0" distB="0" distL="0" distR="0" wp14:anchorId="5674AD2A" wp14:editId="7C1EC652">
+            <wp:extent cx="3586039" cy="1781212"/>
+            <wp:effectExtent l="0" t="0" r="0" b="0"/>
+            <wp:docPr id="7" name="Imagen 7"/>
+            <wp:cNvGraphicFramePr>
+              <a:graphicFrameLocks xmlns:a="http://schemas.openxmlformats.org/drawingml/2006/main" noChangeAspect="1"/>
+            </wp:cNvGraphicFramePr>
+            <a:graphic xmlns:a="http://schemas.openxmlformats.org/drawingml/2006/main">
+              <a:graphicData uri="http://schemas.openxmlformats.org/drawingml/2006/picture">
+                <pic:pic xmlns:pic="http://schemas.openxmlformats.org/drawingml/2006/picture">
+                  <pic:nvPicPr>
+                    <pic:cNvPr id="1" name=""/>
+                    <pic:cNvPicPr/>
+                  </pic:nvPicPr>
+                  <pic:blipFill>
+                    <a:blip r:embed="rId14"/>
+                    <a:stretch>
+                      <a:fillRect/>
+                    </a:stretch>
+                  </pic:blipFill>
+                  <pic:spPr>
+                    <a:xfrm>
+                      <a:off x="0" y="0"/>
+                      <a:ext cx="3590840" cy="1783597"/>
+                    </a:xfrm>
+                    <a:prstGeom prst="rect">
+                      <a:avLst/>
+                    </a:prstGeom>
+                  </pic:spPr>
+                </pic:pic>
+              </a:graphicData>
+            </a:graphic>
+          </wp:inline>
+        </w:drawing>
+      </w:r>
+    </w:p>
     <w:p>
       <w:r>
         <w:t>2.- Creamos un archivo llamado .</w:t>
@@ -838,7 +1005,48 @@
         <w:t>/www/2smr con estos datos:</w:t>
       </w:r>
     </w:p>
-    <w:p/>
+    <w:p>
+      <w:r>
+        <w:rPr>
+          <w:noProof/>
+        </w:rPr>
+        <w:drawing>
+          <wp:inline distT="0" distB="0" distL="0" distR="0" wp14:anchorId="65BC7BE8" wp14:editId="73E7A581">
+            <wp:extent cx="3005593" cy="721122"/>
+            <wp:effectExtent l="0" t="0" r="4445" b="3175"/>
+            <wp:docPr id="8" name="Imagen 8"/>
+            <wp:cNvGraphicFramePr>
+              <a:graphicFrameLocks xmlns:a="http://schemas.openxmlformats.org/drawingml/2006/main" noChangeAspect="1"/>
+            </wp:cNvGraphicFramePr>
+            <a:graphic xmlns:a="http://schemas.openxmlformats.org/drawingml/2006/main">
+              <a:graphicData uri="http://schemas.openxmlformats.org/drawingml/2006/picture">
+                <pic:pic xmlns:pic="http://schemas.openxmlformats.org/drawingml/2006/picture">
+                  <pic:nvPicPr>
+                    <pic:cNvPr id="1" name=""/>
+                    <pic:cNvPicPr/>
+                  </pic:nvPicPr>
+                  <pic:blipFill>
+                    <a:blip r:embed="rId15"/>
+                    <a:stretch>
+                      <a:fillRect/>
+                    </a:stretch>
+                  </pic:blipFill>
+                  <pic:spPr>
+                    <a:xfrm>
+                      <a:off x="0" y="0"/>
+                      <a:ext cx="3013842" cy="723101"/>
+                    </a:xfrm>
+                    <a:prstGeom prst="rect">
+                      <a:avLst/>
+                    </a:prstGeom>
+                  </pic:spPr>
+                </pic:pic>
+              </a:graphicData>
+            </a:graphic>
+          </wp:inline>
+        </w:drawing>
+      </w:r>
+    </w:p>
     <w:p>
       <w:proofErr w:type="spellStart"/>
       <w:r>
@@ -916,13 +1124,180 @@
       </w:r>
       <w:proofErr w:type="spellEnd"/>
     </w:p>
-    <w:p/>
+    <w:p>
+      <w:r>
+        <w:rPr>
+          <w:noProof/>
+        </w:rPr>
+        <w:drawing>
+          <wp:inline distT="0" distB="0" distL="0" distR="0" wp14:anchorId="2740B72B" wp14:editId="3AB76AD4">
+            <wp:extent cx="5400040" cy="144780"/>
+            <wp:effectExtent l="0" t="0" r="0" b="7620"/>
+            <wp:docPr id="9" name="Imagen 9"/>
+            <wp:cNvGraphicFramePr>
+              <a:graphicFrameLocks xmlns:a="http://schemas.openxmlformats.org/drawingml/2006/main" noChangeAspect="1"/>
+            </wp:cNvGraphicFramePr>
+            <a:graphic xmlns:a="http://schemas.openxmlformats.org/drawingml/2006/main">
+              <a:graphicData uri="http://schemas.openxmlformats.org/drawingml/2006/picture">
+                <pic:pic xmlns:pic="http://schemas.openxmlformats.org/drawingml/2006/picture">
+                  <pic:nvPicPr>
+                    <pic:cNvPr id="1" name=""/>
+                    <pic:cNvPicPr/>
+                  </pic:nvPicPr>
+                  <pic:blipFill>
+                    <a:blip r:embed="rId16"/>
+                    <a:stretch>
+                      <a:fillRect/>
+                    </a:stretch>
+                  </pic:blipFill>
+                  <pic:spPr>
+                    <a:xfrm>
+                      <a:off x="0" y="0"/>
+                      <a:ext cx="5400040" cy="144780"/>
+                    </a:xfrm>
+                    <a:prstGeom prst="rect">
+                      <a:avLst/>
+                    </a:prstGeom>
+                  </pic:spPr>
+                </pic:pic>
+              </a:graphicData>
+            </a:graphic>
+          </wp:inline>
+        </w:drawing>
+      </w:r>
+    </w:p>
     <w:p>
       <w:r>
         <w:t>Entramos en la página www.2smr.com</w:t>
       </w:r>
     </w:p>
-    <w:p/>
+    <w:p>
+      <w:r>
+        <w:rPr>
+          <w:noProof/>
+        </w:rPr>
+        <w:drawing>
+          <wp:inline distT="0" distB="0" distL="0" distR="0" wp14:anchorId="77FCC5EF" wp14:editId="3C5F28C8">
+            <wp:extent cx="3705955" cy="2542547"/>
+            <wp:effectExtent l="0" t="0" r="8890" b="0"/>
+            <wp:docPr id="11" name="Imagen 11"/>
+            <wp:cNvGraphicFramePr>
+              <a:graphicFrameLocks xmlns:a="http://schemas.openxmlformats.org/drawingml/2006/main" noChangeAspect="1"/>
+            </wp:cNvGraphicFramePr>
+            <a:graphic xmlns:a="http://schemas.openxmlformats.org/drawingml/2006/main">
+              <a:graphicData uri="http://schemas.openxmlformats.org/drawingml/2006/picture">
+                <pic:pic xmlns:pic="http://schemas.openxmlformats.org/drawingml/2006/picture">
+                  <pic:nvPicPr>
+                    <pic:cNvPr id="1" name=""/>
+                    <pic:cNvPicPr/>
+                  </pic:nvPicPr>
+                  <pic:blipFill>
+                    <a:blip r:embed="rId17"/>
+                    <a:stretch>
+                      <a:fillRect/>
+                    </a:stretch>
+                  </pic:blipFill>
+                  <pic:spPr>
+                    <a:xfrm>
+                      <a:off x="0" y="0"/>
+                      <a:ext cx="3707850" cy="2543847"/>
+                    </a:xfrm>
+                    <a:prstGeom prst="rect">
+                      <a:avLst/>
+                    </a:prstGeom>
+                  </pic:spPr>
+                </pic:pic>
+              </a:graphicData>
+            </a:graphic>
+          </wp:inline>
+        </w:drawing>
+      </w:r>
+    </w:p>
+    <w:p>
+      <w:r>
+        <w:rPr>
+          <w:noProof/>
+        </w:rPr>
+        <w:lastRenderedPageBreak/>
+        <w:drawing>
+          <wp:inline distT="0" distB="0" distL="0" distR="0" wp14:anchorId="64AD191D" wp14:editId="18BCB5EB">
+            <wp:extent cx="5400040" cy="2132965"/>
+            <wp:effectExtent l="0" t="0" r="0" b="635"/>
+            <wp:docPr id="12" name="Imagen 12"/>
+            <wp:cNvGraphicFramePr>
+              <a:graphicFrameLocks xmlns:a="http://schemas.openxmlformats.org/drawingml/2006/main" noChangeAspect="1"/>
+            </wp:cNvGraphicFramePr>
+            <a:graphic xmlns:a="http://schemas.openxmlformats.org/drawingml/2006/main">
+              <a:graphicData uri="http://schemas.openxmlformats.org/drawingml/2006/picture">
+                <pic:pic xmlns:pic="http://schemas.openxmlformats.org/drawingml/2006/picture">
+                  <pic:nvPicPr>
+                    <pic:cNvPr id="1" name=""/>
+                    <pic:cNvPicPr/>
+                  </pic:nvPicPr>
+                  <pic:blipFill>
+                    <a:blip r:embed="rId18"/>
+                    <a:stretch>
+                      <a:fillRect/>
+                    </a:stretch>
+                  </pic:blipFill>
+                  <pic:spPr>
+                    <a:xfrm>
+                      <a:off x="0" y="0"/>
+                      <a:ext cx="5400040" cy="2132965"/>
+                    </a:xfrm>
+                    <a:prstGeom prst="rect">
+                      <a:avLst/>
+                    </a:prstGeom>
+                  </pic:spPr>
+                </pic:pic>
+              </a:graphicData>
+            </a:graphic>
+          </wp:inline>
+        </w:drawing>
+      </w:r>
+    </w:p>
+    <w:p>
+      <w:r>
+        <w:rPr>
+          <w:noProof/>
+        </w:rPr>
+        <w:drawing>
+          <wp:inline distT="0" distB="0" distL="0" distR="0" wp14:anchorId="26D47C2D" wp14:editId="40AC8145">
+            <wp:extent cx="5066667" cy="1561905"/>
+            <wp:effectExtent l="0" t="0" r="635" b="635"/>
+            <wp:docPr id="13" name="Imagen 13"/>
+            <wp:cNvGraphicFramePr>
+              <a:graphicFrameLocks xmlns:a="http://schemas.openxmlformats.org/drawingml/2006/main" noChangeAspect="1"/>
+            </wp:cNvGraphicFramePr>
+            <a:graphic xmlns:a="http://schemas.openxmlformats.org/drawingml/2006/main">
+              <a:graphicData uri="http://schemas.openxmlformats.org/drawingml/2006/picture">
+                <pic:pic xmlns:pic="http://schemas.openxmlformats.org/drawingml/2006/picture">
+                  <pic:nvPicPr>
+                    <pic:cNvPr id="1" name=""/>
+                    <pic:cNvPicPr/>
+                  </pic:nvPicPr>
+                  <pic:blipFill>
+                    <a:blip r:embed="rId19"/>
+                    <a:stretch>
+                      <a:fillRect/>
+                    </a:stretch>
+                  </pic:blipFill>
+                  <pic:spPr>
+                    <a:xfrm>
+                      <a:off x="0" y="0"/>
+                      <a:ext cx="5066667" cy="1561905"/>
+                    </a:xfrm>
+                    <a:prstGeom prst="rect">
+                      <a:avLst/>
+                    </a:prstGeom>
+                  </pic:spPr>
+                </pic:pic>
+              </a:graphicData>
+            </a:graphic>
+          </wp:inline>
+        </w:drawing>
+      </w:r>
+    </w:p>
     <w:p>
       <w:r>
         <w:t>En el archivo de configuración .</w:t>
@@ -941,426 +1316,614 @@
       </w:r>
       <w:proofErr w:type="spellEnd"/>
       <w:r>
-        <w:t xml:space="preserve"> permite hacer que cuando se haga una petición a una página que no existe en nuestra web (es el error 404 del servidor web, página web no encontrada), salga una página personalizada que </w:t>
-      </w:r>
+        <w:t xml:space="preserve"> permite hacer que cuando se haga una petición a una página que no existe en nuestra web (es el error 404 del servidor web, página web no encontrada), salga una página personalizada que hayamos creado nosotros. Creamos dicha página web, la llamamos por ejemplo noexiste.html y la guardamos en la carpeta donde esté la página index.html de nuestro sitio web.</w:t>
+      </w:r>
+    </w:p>
+    <w:p>
+      <w:r>
+        <w:rPr>
+          <w:noProof/>
+        </w:rPr>
+        <w:drawing>
+          <wp:anchor distT="0" distB="0" distL="114300" distR="114300" simplePos="0" relativeHeight="251658240" behindDoc="1" locked="0" layoutInCell="1" allowOverlap="1" wp14:anchorId="3831DE1F" wp14:editId="3369033F">
+            <wp:simplePos x="0" y="0"/>
+            <wp:positionH relativeFrom="column">
+              <wp:posOffset>1774907</wp:posOffset>
+            </wp:positionH>
+            <wp:positionV relativeFrom="paragraph">
+              <wp:posOffset>418659</wp:posOffset>
+            </wp:positionV>
+            <wp:extent cx="4468495" cy="1148080"/>
+            <wp:effectExtent l="0" t="0" r="8255" b="0"/>
+            <wp:wrapTight wrapText="bothSides">
+              <wp:wrapPolygon edited="0">
+                <wp:start x="0" y="0"/>
+                <wp:lineTo x="0" y="21146"/>
+                <wp:lineTo x="21548" y="21146"/>
+                <wp:lineTo x="21548" y="0"/>
+                <wp:lineTo x="0" y="0"/>
+              </wp:wrapPolygon>
+            </wp:wrapTight>
+            <wp:docPr id="14" name="Imagen 14"/>
+            <wp:cNvGraphicFramePr>
+              <a:graphicFrameLocks xmlns:a="http://schemas.openxmlformats.org/drawingml/2006/main" noChangeAspect="1"/>
+            </wp:cNvGraphicFramePr>
+            <a:graphic xmlns:a="http://schemas.openxmlformats.org/drawingml/2006/main">
+              <a:graphicData uri="http://schemas.openxmlformats.org/drawingml/2006/picture">
+                <pic:pic xmlns:pic="http://schemas.openxmlformats.org/drawingml/2006/picture">
+                  <pic:nvPicPr>
+                    <pic:cNvPr id="1" name=""/>
+                    <pic:cNvPicPr/>
+                  </pic:nvPicPr>
+                  <pic:blipFill>
+                    <a:blip r:embed="rId20">
+                      <a:extLst>
+                        <a:ext uri="{28A0092B-C50C-407E-A947-70E740481C1C}">
+                          <a14:useLocalDpi xmlns:a14="http://schemas.microsoft.com/office/drawing/2010/main" val="0"/>
+                        </a:ext>
+                      </a:extLst>
+                    </a:blip>
+                    <a:stretch>
+                      <a:fillRect/>
+                    </a:stretch>
+                  </pic:blipFill>
+                  <pic:spPr>
+                    <a:xfrm>
+                      <a:off x="0" y="0"/>
+                      <a:ext cx="4468495" cy="1148080"/>
+                    </a:xfrm>
+                    <a:prstGeom prst="rect">
+                      <a:avLst/>
+                    </a:prstGeom>
+                  </pic:spPr>
+                </pic:pic>
+              </a:graphicData>
+            </a:graphic>
+            <wp14:sizeRelH relativeFrom="margin">
+              <wp14:pctWidth>0</wp14:pctWidth>
+            </wp14:sizeRelH>
+            <wp14:sizeRelV relativeFrom="margin">
+              <wp14:pctHeight>0</wp14:pctHeight>
+            </wp14:sizeRelV>
+          </wp:anchor>
+        </w:drawing>
+      </w:r>
+      <w:r>
+        <w:t>En nuestro ejemplo vamos a crear noexiste.html en la carpeta /</w:t>
+      </w:r>
+      <w:proofErr w:type="spellStart"/>
+      <w:r>
+        <w:t>var</w:t>
+      </w:r>
+      <w:proofErr w:type="spellEnd"/>
+      <w:r>
+        <w:t xml:space="preserve">/www/2smr con este código </w:t>
+      </w:r>
+      <w:proofErr w:type="spellStart"/>
+      <w:r>
+        <w:t>html</w:t>
+      </w:r>
+      <w:proofErr w:type="spellEnd"/>
+      <w:r>
+        <w:t>:</w:t>
+      </w:r>
+    </w:p>
+    <w:p>
+      <w:pPr>
+        <w:rPr>
+          <w:sz w:val="16"/>
+          <w:szCs w:val="16"/>
+        </w:rPr>
+      </w:pPr>
+      <w:r>
+        <w:rPr>
+          <w:sz w:val="16"/>
+          <w:szCs w:val="16"/>
+        </w:rPr>
+        <w:t>&lt;</w:t>
+      </w:r>
+      <w:proofErr w:type="spellStart"/>
+      <w:r>
+        <w:rPr>
+          <w:sz w:val="16"/>
+          <w:szCs w:val="16"/>
+        </w:rPr>
+        <w:t>html</w:t>
+      </w:r>
+      <w:proofErr w:type="spellEnd"/>
+      <w:r>
+        <w:rPr>
+          <w:sz w:val="16"/>
+          <w:szCs w:val="16"/>
+        </w:rPr>
+        <w:t>&gt;</w:t>
+      </w:r>
+    </w:p>
+    <w:p>
+      <w:pPr>
+        <w:rPr>
+          <w:sz w:val="16"/>
+          <w:szCs w:val="16"/>
+        </w:rPr>
+      </w:pPr>
+      <w:r>
+        <w:rPr>
+          <w:sz w:val="16"/>
+          <w:szCs w:val="16"/>
+        </w:rPr>
+        <w:t>&lt;head&gt;</w:t>
+      </w:r>
+    </w:p>
+    <w:p>
+      <w:pPr>
+        <w:rPr>
+          <w:sz w:val="16"/>
+          <w:szCs w:val="16"/>
+        </w:rPr>
+      </w:pPr>
+      <w:r>
+        <w:rPr>
+          <w:sz w:val="16"/>
+          <w:szCs w:val="16"/>
+        </w:rPr>
+        <w:t>&lt;</w:t>
+      </w:r>
+      <w:proofErr w:type="spellStart"/>
+      <w:r>
+        <w:rPr>
+          <w:sz w:val="16"/>
+          <w:szCs w:val="16"/>
+        </w:rPr>
+        <w:t>title</w:t>
+      </w:r>
+      <w:proofErr w:type="spellEnd"/>
+      <w:r>
+        <w:rPr>
+          <w:sz w:val="16"/>
+          <w:szCs w:val="16"/>
+        </w:rPr>
+        <w:t>&gt;Pagina no existe&lt;/</w:t>
+      </w:r>
+      <w:proofErr w:type="spellStart"/>
+      <w:r>
+        <w:rPr>
+          <w:sz w:val="16"/>
+          <w:szCs w:val="16"/>
+        </w:rPr>
+        <w:t>title</w:t>
+      </w:r>
+      <w:proofErr w:type="spellEnd"/>
+      <w:r>
+        <w:rPr>
+          <w:sz w:val="16"/>
+          <w:szCs w:val="16"/>
+        </w:rPr>
+        <w:t>&gt;</w:t>
+      </w:r>
+    </w:p>
+    <w:p>
+      <w:pPr>
+        <w:rPr>
+          <w:sz w:val="16"/>
+          <w:szCs w:val="16"/>
+        </w:rPr>
+      </w:pPr>
+      <w:r>
+        <w:rPr>
+          <w:sz w:val="16"/>
+          <w:szCs w:val="16"/>
+        </w:rPr>
+        <w:t>&lt;/head&gt;</w:t>
+      </w:r>
+    </w:p>
+    <w:p>
+      <w:pPr>
+        <w:rPr>
+          <w:sz w:val="16"/>
+          <w:szCs w:val="16"/>
+        </w:rPr>
+      </w:pPr>
+      <w:r>
+        <w:rPr>
+          <w:sz w:val="16"/>
+          <w:szCs w:val="16"/>
+        </w:rPr>
+        <w:t>&lt;</w:t>
+      </w:r>
+      <w:proofErr w:type="spellStart"/>
+      <w:r>
+        <w:rPr>
+          <w:sz w:val="16"/>
+          <w:szCs w:val="16"/>
+        </w:rPr>
+        <w:t>body</w:t>
+      </w:r>
+      <w:proofErr w:type="spellEnd"/>
+      <w:r>
+        <w:rPr>
+          <w:sz w:val="16"/>
+          <w:szCs w:val="16"/>
+        </w:rPr>
+        <w:t>&gt;</w:t>
+      </w:r>
+    </w:p>
+    <w:p>
+      <w:pPr>
+        <w:rPr>
+          <w:sz w:val="16"/>
+          <w:szCs w:val="16"/>
+        </w:rPr>
+      </w:pPr>
+      <w:r>
+        <w:rPr>
+          <w:sz w:val="16"/>
+          <w:szCs w:val="16"/>
+        </w:rPr>
+        <w:t>&lt;</w:t>
+      </w:r>
+      <w:proofErr w:type="spellStart"/>
+      <w:r>
+        <w:rPr>
+          <w:sz w:val="16"/>
+          <w:szCs w:val="16"/>
+        </w:rPr>
+        <w:t>img</w:t>
+      </w:r>
+      <w:proofErr w:type="spellEnd"/>
+      <w:r>
+        <w:rPr>
+          <w:sz w:val="16"/>
+          <w:szCs w:val="16"/>
+        </w:rPr>
+        <w:t xml:space="preserve"> </w:t>
+      </w:r>
+      <w:proofErr w:type="spellStart"/>
+      <w:r>
+        <w:rPr>
+          <w:sz w:val="16"/>
+          <w:szCs w:val="16"/>
+        </w:rPr>
+        <w:t>style</w:t>
+      </w:r>
+      <w:proofErr w:type="spellEnd"/>
+      <w:r>
+        <w:rPr>
+          <w:sz w:val="16"/>
+          <w:szCs w:val="16"/>
+        </w:rPr>
+        <w:t>="</w:t>
+      </w:r>
+      <w:proofErr w:type="spellStart"/>
+      <w:r>
+        <w:rPr>
+          <w:sz w:val="16"/>
+          <w:szCs w:val="16"/>
+        </w:rPr>
+        <w:t>width</w:t>
+      </w:r>
+      <w:proofErr w:type="spellEnd"/>
+      <w:r>
+        <w:rPr>
+          <w:sz w:val="16"/>
+          <w:szCs w:val="16"/>
+        </w:rPr>
+        <w:t xml:space="preserve">: 600px; </w:t>
+      </w:r>
+      <w:proofErr w:type="spellStart"/>
+      <w:r>
+        <w:rPr>
+          <w:sz w:val="16"/>
+          <w:szCs w:val="16"/>
+        </w:rPr>
+        <w:t>height</w:t>
+      </w:r>
+      <w:proofErr w:type="spellEnd"/>
+      <w:r>
+        <w:rPr>
+          <w:sz w:val="16"/>
+          <w:szCs w:val="16"/>
+        </w:rPr>
+        <w:t xml:space="preserve">: 800px;" </w:t>
+      </w:r>
+      <w:proofErr w:type="spellStart"/>
+      <w:r>
+        <w:rPr>
+          <w:sz w:val="16"/>
+          <w:szCs w:val="16"/>
+        </w:rPr>
+        <w:t>alt</w:t>
+      </w:r>
+      <w:proofErr w:type="spellEnd"/>
+      <w:r>
+        <w:rPr>
+          <w:sz w:val="16"/>
+          <w:szCs w:val="16"/>
+        </w:rPr>
+        <w:t xml:space="preserve">="prueba" </w:t>
+      </w:r>
+      <w:proofErr w:type="spellStart"/>
+      <w:r>
+        <w:rPr>
+          <w:sz w:val="16"/>
+          <w:szCs w:val="16"/>
+        </w:rPr>
+        <w:t>src</w:t>
+      </w:r>
+      <w:proofErr w:type="spellEnd"/>
+      <w:r>
+        <w:rPr>
+          <w:sz w:val="16"/>
+          <w:szCs w:val="16"/>
+        </w:rPr>
+        <w:t>="error404.jpg"&gt; &lt;</w:t>
+      </w:r>
+      <w:proofErr w:type="spellStart"/>
+      <w:r>
+        <w:rPr>
+          <w:sz w:val="16"/>
+          <w:szCs w:val="16"/>
+        </w:rPr>
+        <w:t>br</w:t>
+      </w:r>
+      <w:proofErr w:type="spellEnd"/>
+      <w:r>
+        <w:rPr>
+          <w:sz w:val="16"/>
+          <w:szCs w:val="16"/>
+        </w:rPr>
+        <w:t>&gt;</w:t>
+      </w:r>
+    </w:p>
+    <w:p>
+      <w:pPr>
+        <w:rPr>
+          <w:sz w:val="16"/>
+          <w:szCs w:val="16"/>
+        </w:rPr>
+      </w:pPr>
+      <w:r>
+        <w:rPr>
+          <w:sz w:val="16"/>
+          <w:szCs w:val="16"/>
+        </w:rPr>
+        <w:t>&lt;</w:t>
+      </w:r>
+      <w:proofErr w:type="spellStart"/>
+      <w:r>
+        <w:rPr>
+          <w:sz w:val="16"/>
+          <w:szCs w:val="16"/>
+        </w:rPr>
+        <w:t>br</w:t>
+      </w:r>
+      <w:proofErr w:type="spellEnd"/>
+      <w:r>
+        <w:rPr>
+          <w:sz w:val="16"/>
+          <w:szCs w:val="16"/>
+        </w:rPr>
+        <w:t>&gt;</w:t>
+      </w:r>
+    </w:p>
+    <w:p>
+      <w:pPr>
+        <w:rPr>
+          <w:sz w:val="16"/>
+          <w:szCs w:val="16"/>
+        </w:rPr>
+      </w:pPr>
+      <w:r>
+        <w:rPr>
+          <w:sz w:val="16"/>
+          <w:szCs w:val="16"/>
+        </w:rPr>
+        <w:t>&lt;/</w:t>
+      </w:r>
+      <w:proofErr w:type="spellStart"/>
+      <w:r>
+        <w:rPr>
+          <w:sz w:val="16"/>
+          <w:szCs w:val="16"/>
+        </w:rPr>
+        <w:t>body</w:t>
+      </w:r>
+      <w:proofErr w:type="spellEnd"/>
+      <w:r>
+        <w:rPr>
+          <w:sz w:val="16"/>
+          <w:szCs w:val="16"/>
+        </w:rPr>
+        <w:t>&gt;</w:t>
+      </w:r>
+    </w:p>
+    <w:p>
+      <w:pPr>
+        <w:rPr>
+          <w:sz w:val="16"/>
+          <w:szCs w:val="16"/>
+        </w:rPr>
+      </w:pPr>
+      <w:r>
+        <w:rPr>
+          <w:sz w:val="16"/>
+          <w:szCs w:val="16"/>
+        </w:rPr>
+        <w:t>&lt;/</w:t>
+      </w:r>
+      <w:proofErr w:type="spellStart"/>
+      <w:r>
+        <w:rPr>
+          <w:sz w:val="16"/>
+          <w:szCs w:val="16"/>
+        </w:rPr>
+        <w:t>html</w:t>
+      </w:r>
+      <w:proofErr w:type="spellEnd"/>
+      <w:r>
+        <w:rPr>
+          <w:sz w:val="16"/>
+          <w:szCs w:val="16"/>
+        </w:rPr>
+        <w:t>&gt;</w:t>
+      </w:r>
+    </w:p>
+    <w:p>
+      <w:r>
+        <w:t>También hay que poner un archivo en la carpeta /</w:t>
+      </w:r>
+      <w:proofErr w:type="spellStart"/>
+      <w:r>
+        <w:t>var</w:t>
+      </w:r>
+      <w:proofErr w:type="spellEnd"/>
+      <w:r>
+        <w:t>/www/2smr llamado en nuestro ejemplo error404.jpg</w:t>
+      </w:r>
+    </w:p>
+    <w:p>
       <w:r>
         <w:lastRenderedPageBreak/>
-        <w:t>hayamos creado nosotros. Creamos dicha página web, la llamamos por ejemplo noexiste.html y la guardamos en la carpeta donde esté la página index.html de nuestro sitio web.</w:t>
-      </w:r>
-    </w:p>
-    <w:p>
-      <w:r>
-        <w:t>En nuestro ejemplo vamos a crear noexiste.html en la carpeta /</w:t>
-      </w:r>
-      <w:proofErr w:type="spellStart"/>
-      <w:r>
-        <w:t>var</w:t>
-      </w:r>
-      <w:proofErr w:type="spellEnd"/>
-      <w:r>
-        <w:t xml:space="preserve">/www/2smr con este código </w:t>
-      </w:r>
-      <w:proofErr w:type="spellStart"/>
-      <w:r>
-        <w:t>html</w:t>
-      </w:r>
-      <w:proofErr w:type="spellEnd"/>
-      <w:r>
-        <w:t>:</w:t>
-      </w:r>
-    </w:p>
-    <w:p>
-      <w:pPr>
-        <w:rPr>
-          <w:sz w:val="16"/>
-          <w:szCs w:val="16"/>
-        </w:rPr>
-      </w:pPr>
-      <w:r>
-        <w:rPr>
-          <w:sz w:val="16"/>
-          <w:szCs w:val="16"/>
-        </w:rPr>
-        <w:t>&lt;</w:t>
-      </w:r>
-      <w:proofErr w:type="spellStart"/>
-      <w:r>
-        <w:rPr>
-          <w:sz w:val="16"/>
-          <w:szCs w:val="16"/>
-        </w:rPr>
-        <w:t>html</w:t>
-      </w:r>
-      <w:proofErr w:type="spellEnd"/>
-      <w:r>
-        <w:rPr>
-          <w:sz w:val="16"/>
-          <w:szCs w:val="16"/>
-        </w:rPr>
-        <w:t>&gt;</w:t>
-      </w:r>
-    </w:p>
-    <w:p>
-      <w:pPr>
-        <w:rPr>
-          <w:sz w:val="16"/>
-          <w:szCs w:val="16"/>
-        </w:rPr>
-      </w:pPr>
-      <w:r>
-        <w:rPr>
-          <w:sz w:val="16"/>
-          <w:szCs w:val="16"/>
-        </w:rPr>
-        <w:t>&lt;head&gt;</w:t>
-      </w:r>
-    </w:p>
-    <w:p>
-      <w:pPr>
-        <w:rPr>
-          <w:sz w:val="16"/>
-          <w:szCs w:val="16"/>
-        </w:rPr>
-      </w:pPr>
-      <w:r>
-        <w:rPr>
-          <w:sz w:val="16"/>
-          <w:szCs w:val="16"/>
-        </w:rPr>
-        <w:t>&lt;</w:t>
-      </w:r>
-      <w:proofErr w:type="spellStart"/>
-      <w:r>
-        <w:rPr>
-          <w:sz w:val="16"/>
-          <w:szCs w:val="16"/>
-        </w:rPr>
-        <w:t>title</w:t>
-      </w:r>
-      <w:proofErr w:type="spellEnd"/>
-      <w:r>
-        <w:rPr>
-          <w:sz w:val="16"/>
-          <w:szCs w:val="16"/>
-        </w:rPr>
-        <w:t>&gt;Pagina no existe&lt;/</w:t>
-      </w:r>
-      <w:proofErr w:type="spellStart"/>
-      <w:r>
-        <w:rPr>
-          <w:sz w:val="16"/>
-          <w:szCs w:val="16"/>
-        </w:rPr>
-        <w:t>title</w:t>
-      </w:r>
-      <w:proofErr w:type="spellEnd"/>
-      <w:r>
-        <w:rPr>
-          <w:sz w:val="16"/>
-          <w:szCs w:val="16"/>
-        </w:rPr>
-        <w:t>&gt;</w:t>
-      </w:r>
-    </w:p>
-    <w:p>
-      <w:pPr>
-        <w:rPr>
-          <w:sz w:val="16"/>
-          <w:szCs w:val="16"/>
-        </w:rPr>
-      </w:pPr>
-      <w:r>
-        <w:rPr>
-          <w:sz w:val="16"/>
-          <w:szCs w:val="16"/>
-        </w:rPr>
-        <w:t>&lt;/head&gt;</w:t>
-      </w:r>
-    </w:p>
-    <w:p>
-      <w:pPr>
-        <w:rPr>
-          <w:sz w:val="16"/>
-          <w:szCs w:val="16"/>
-        </w:rPr>
-      </w:pPr>
-      <w:r>
-        <w:rPr>
-          <w:sz w:val="16"/>
-          <w:szCs w:val="16"/>
-        </w:rPr>
-        <w:t>&lt;</w:t>
-      </w:r>
-      <w:proofErr w:type="spellStart"/>
-      <w:r>
-        <w:rPr>
-          <w:sz w:val="16"/>
-          <w:szCs w:val="16"/>
-        </w:rPr>
-        <w:t>body</w:t>
-      </w:r>
-      <w:proofErr w:type="spellEnd"/>
-      <w:r>
-        <w:rPr>
-          <w:sz w:val="16"/>
-          <w:szCs w:val="16"/>
-        </w:rPr>
-        <w:t>&gt;</w:t>
-      </w:r>
-    </w:p>
-    <w:p>
-      <w:pPr>
-        <w:rPr>
-          <w:sz w:val="16"/>
-          <w:szCs w:val="16"/>
-        </w:rPr>
-      </w:pPr>
-      <w:r>
-        <w:rPr>
-          <w:sz w:val="16"/>
-          <w:szCs w:val="16"/>
-        </w:rPr>
-        <w:t>&lt;</w:t>
-      </w:r>
-      <w:proofErr w:type="spellStart"/>
-      <w:r>
-        <w:rPr>
-          <w:sz w:val="16"/>
-          <w:szCs w:val="16"/>
-        </w:rPr>
-        <w:t>img</w:t>
-      </w:r>
-      <w:proofErr w:type="spellEnd"/>
-      <w:r>
-        <w:rPr>
-          <w:sz w:val="16"/>
-          <w:szCs w:val="16"/>
-        </w:rPr>
-        <w:t xml:space="preserve"> </w:t>
-      </w:r>
-      <w:proofErr w:type="spellStart"/>
-      <w:r>
-        <w:rPr>
-          <w:sz w:val="16"/>
-          <w:szCs w:val="16"/>
-        </w:rPr>
-        <w:t>style</w:t>
-      </w:r>
-      <w:proofErr w:type="spellEnd"/>
-      <w:r>
-        <w:rPr>
-          <w:sz w:val="16"/>
-          <w:szCs w:val="16"/>
-        </w:rPr>
-        <w:t>="</w:t>
-      </w:r>
-      <w:proofErr w:type="spellStart"/>
-      <w:r>
-        <w:rPr>
-          <w:sz w:val="16"/>
-          <w:szCs w:val="16"/>
-        </w:rPr>
-        <w:t>width</w:t>
-      </w:r>
-      <w:proofErr w:type="spellEnd"/>
-      <w:r>
-        <w:rPr>
-          <w:sz w:val="16"/>
-          <w:szCs w:val="16"/>
-        </w:rPr>
-        <w:t xml:space="preserve">: 600px; </w:t>
-      </w:r>
-      <w:proofErr w:type="spellStart"/>
-      <w:r>
-        <w:rPr>
-          <w:sz w:val="16"/>
-          <w:szCs w:val="16"/>
-        </w:rPr>
-        <w:t>height</w:t>
-      </w:r>
-      <w:proofErr w:type="spellEnd"/>
-      <w:r>
-        <w:rPr>
-          <w:sz w:val="16"/>
-          <w:szCs w:val="16"/>
-        </w:rPr>
-        <w:t xml:space="preserve">: 800px;" </w:t>
-      </w:r>
-      <w:proofErr w:type="spellStart"/>
-      <w:r>
-        <w:rPr>
-          <w:sz w:val="16"/>
-          <w:szCs w:val="16"/>
-        </w:rPr>
-        <w:t>alt</w:t>
-      </w:r>
-      <w:proofErr w:type="spellEnd"/>
-      <w:r>
-        <w:rPr>
-          <w:sz w:val="16"/>
-          <w:szCs w:val="16"/>
-        </w:rPr>
-        <w:t xml:space="preserve">="prueba" </w:t>
-      </w:r>
-      <w:proofErr w:type="spellStart"/>
-      <w:r>
-        <w:rPr>
-          <w:sz w:val="16"/>
-          <w:szCs w:val="16"/>
-        </w:rPr>
-        <w:t>src</w:t>
-      </w:r>
-      <w:proofErr w:type="spellEnd"/>
-      <w:r>
-        <w:rPr>
-          <w:sz w:val="16"/>
-          <w:szCs w:val="16"/>
-        </w:rPr>
-        <w:t>="error404.jpg"&gt; &lt;</w:t>
-      </w:r>
-      <w:proofErr w:type="spellStart"/>
-      <w:r>
-        <w:rPr>
-          <w:sz w:val="16"/>
-          <w:szCs w:val="16"/>
-        </w:rPr>
-        <w:t>br</w:t>
-      </w:r>
-      <w:proofErr w:type="spellEnd"/>
-      <w:r>
-        <w:rPr>
-          <w:sz w:val="16"/>
-          <w:szCs w:val="16"/>
-        </w:rPr>
-        <w:t>&gt;</w:t>
-      </w:r>
-    </w:p>
-    <w:p>
-      <w:pPr>
-        <w:rPr>
-          <w:sz w:val="16"/>
-          <w:szCs w:val="16"/>
-        </w:rPr>
-      </w:pPr>
-      <w:r>
-        <w:rPr>
-          <w:sz w:val="16"/>
-          <w:szCs w:val="16"/>
-        </w:rPr>
-        <w:t>&lt;</w:t>
-      </w:r>
-      <w:proofErr w:type="spellStart"/>
-      <w:r>
-        <w:rPr>
-          <w:sz w:val="16"/>
-          <w:szCs w:val="16"/>
-        </w:rPr>
-        <w:t>br</w:t>
-      </w:r>
-      <w:proofErr w:type="spellEnd"/>
-      <w:r>
-        <w:rPr>
-          <w:sz w:val="16"/>
-          <w:szCs w:val="16"/>
-        </w:rPr>
-        <w:t>&gt;</w:t>
-      </w:r>
-    </w:p>
-    <w:p>
-      <w:pPr>
-        <w:rPr>
-          <w:sz w:val="16"/>
-          <w:szCs w:val="16"/>
-        </w:rPr>
-      </w:pPr>
-      <w:r>
-        <w:rPr>
-          <w:sz w:val="16"/>
-          <w:szCs w:val="16"/>
-        </w:rPr>
-        <w:t>&lt;/</w:t>
-      </w:r>
-      <w:proofErr w:type="spellStart"/>
-      <w:r>
-        <w:rPr>
-          <w:sz w:val="16"/>
-          <w:szCs w:val="16"/>
-        </w:rPr>
-        <w:t>body</w:t>
-      </w:r>
-      <w:proofErr w:type="spellEnd"/>
-      <w:r>
-        <w:rPr>
-          <w:sz w:val="16"/>
-          <w:szCs w:val="16"/>
-        </w:rPr>
-        <w:t>&gt;</w:t>
-      </w:r>
-    </w:p>
-    <w:p>
-      <w:pPr>
-        <w:rPr>
-          <w:sz w:val="16"/>
-          <w:szCs w:val="16"/>
-        </w:rPr>
-      </w:pPr>
-      <w:r>
-        <w:rPr>
-          <w:sz w:val="16"/>
-          <w:szCs w:val="16"/>
-        </w:rPr>
-        <w:t>&lt;/</w:t>
-      </w:r>
-      <w:proofErr w:type="spellStart"/>
-      <w:r>
-        <w:rPr>
-          <w:sz w:val="16"/>
-          <w:szCs w:val="16"/>
-        </w:rPr>
-        <w:t>html</w:t>
-      </w:r>
-      <w:proofErr w:type="spellEnd"/>
-      <w:r>
-        <w:rPr>
-          <w:sz w:val="16"/>
-          <w:szCs w:val="16"/>
-        </w:rPr>
-        <w:t>&gt;</w:t>
-      </w:r>
-    </w:p>
-    <w:p>
-      <w:r>
-        <w:t>También hay que poner un archivo en la carpeta /</w:t>
-      </w:r>
-      <w:proofErr w:type="spellStart"/>
-      <w:r>
-        <w:t>var</w:t>
-      </w:r>
-      <w:proofErr w:type="spellEnd"/>
-      <w:r>
-        <w:t>/www/2smr llamado en nuestro ejemplo error404.jpg</w:t>
-      </w:r>
-    </w:p>
-    <w:p>
-      <w:r>
         <w:t>En total, en el sitio web de www.2smr.com hay 3 archivos: la página web (index.html), la página web para cuando se pida una página que no exista y produzca el error 404 (noexiste.html) y la imagen que aparece dentro de la página noexiste.html (error404.jpg)</w:t>
       </w:r>
     </w:p>
     <w:p>
       <w:r>
+        <w:rPr>
+          <w:noProof/>
+        </w:rPr>
+        <w:drawing>
+          <wp:inline distT="0" distB="0" distL="0" distR="0" wp14:anchorId="5EA14087" wp14:editId="0ED23A73">
+            <wp:extent cx="5400040" cy="1431925"/>
+            <wp:effectExtent l="0" t="0" r="0" b="0"/>
+            <wp:docPr id="15" name="Imagen 15"/>
+            <wp:cNvGraphicFramePr>
+              <a:graphicFrameLocks xmlns:a="http://schemas.openxmlformats.org/drawingml/2006/main" noChangeAspect="1"/>
+            </wp:cNvGraphicFramePr>
+            <a:graphic xmlns:a="http://schemas.openxmlformats.org/drawingml/2006/main">
+              <a:graphicData uri="http://schemas.openxmlformats.org/drawingml/2006/picture">
+                <pic:pic xmlns:pic="http://schemas.openxmlformats.org/drawingml/2006/picture">
+                  <pic:nvPicPr>
+                    <pic:cNvPr id="1" name=""/>
+                    <pic:cNvPicPr/>
+                  </pic:nvPicPr>
+                  <pic:blipFill>
+                    <a:blip r:embed="rId21"/>
+                    <a:stretch>
+                      <a:fillRect/>
+                    </a:stretch>
+                  </pic:blipFill>
+                  <pic:spPr>
+                    <a:xfrm>
+                      <a:off x="0" y="0"/>
+                      <a:ext cx="5400040" cy="1431925"/>
+                    </a:xfrm>
+                    <a:prstGeom prst="rect">
+                      <a:avLst/>
+                    </a:prstGeom>
+                  </pic:spPr>
+                </pic:pic>
+              </a:graphicData>
+            </a:graphic>
+          </wp:inline>
+        </w:drawing>
+      </w:r>
+    </w:p>
+    <w:p>
+      <w:r>
         <w:t>Si entramos en www.2smr.com aparecerá la página index.html</w:t>
       </w:r>
     </w:p>
-    <w:p/>
+    <w:p>
+      <w:r>
+        <w:rPr>
+          <w:noProof/>
+        </w:rPr>
+        <w:drawing>
+          <wp:inline distT="0" distB="0" distL="0" distR="0" wp14:anchorId="4D71BD75" wp14:editId="1F7E0F8B">
+            <wp:extent cx="5057143" cy="1285714"/>
+            <wp:effectExtent l="0" t="0" r="0" b="0"/>
+            <wp:docPr id="18" name="Imagen 18"/>
+            <wp:cNvGraphicFramePr>
+              <a:graphicFrameLocks xmlns:a="http://schemas.openxmlformats.org/drawingml/2006/main" noChangeAspect="1"/>
+            </wp:cNvGraphicFramePr>
+            <a:graphic xmlns:a="http://schemas.openxmlformats.org/drawingml/2006/main">
+              <a:graphicData uri="http://schemas.openxmlformats.org/drawingml/2006/picture">
+                <pic:pic xmlns:pic="http://schemas.openxmlformats.org/drawingml/2006/picture">
+                  <pic:nvPicPr>
+                    <pic:cNvPr id="1" name=""/>
+                    <pic:cNvPicPr/>
+                  </pic:nvPicPr>
+                  <pic:blipFill>
+                    <a:blip r:embed="rId22"/>
+                    <a:stretch>
+                      <a:fillRect/>
+                    </a:stretch>
+                  </pic:blipFill>
+                  <pic:spPr>
+                    <a:xfrm>
+                      <a:off x="0" y="0"/>
+                      <a:ext cx="5057143" cy="1285714"/>
+                    </a:xfrm>
+                    <a:prstGeom prst="rect">
+                      <a:avLst/>
+                    </a:prstGeom>
+                  </pic:spPr>
+                </pic:pic>
+              </a:graphicData>
+            </a:graphic>
+          </wp:inline>
+        </w:drawing>
+      </w:r>
+    </w:p>
     <w:p>
       <w:r>
         <w:t>Sin embargo, si solicitamos a ese sitio web www.2smenumr.com una página que no existe, por ejemplo, menu.html, se provocará el error 404 y aparecerá la página noexiste.html</w:t>
       </w:r>
     </w:p>
-    <w:p/>
-    <w:p/>
+    <w:p>
+      <w:r>
+        <w:rPr>
+          <w:noProof/>
+        </w:rPr>
+        <w:drawing>
+          <wp:inline distT="0" distB="0" distL="0" distR="0" wp14:anchorId="0908BA27" wp14:editId="1915FF24">
+            <wp:extent cx="3192462" cy="3745064"/>
+            <wp:effectExtent l="0" t="0" r="8255" b="8255"/>
+            <wp:docPr id="17" name="Imagen 17"/>
+            <wp:cNvGraphicFramePr>
+              <a:graphicFrameLocks xmlns:a="http://schemas.openxmlformats.org/drawingml/2006/main" noChangeAspect="1"/>
+            </wp:cNvGraphicFramePr>
+            <a:graphic xmlns:a="http://schemas.openxmlformats.org/drawingml/2006/main">
+              <a:graphicData uri="http://schemas.openxmlformats.org/drawingml/2006/picture">
+                <pic:pic xmlns:pic="http://schemas.openxmlformats.org/drawingml/2006/picture">
+                  <pic:nvPicPr>
+                    <pic:cNvPr id="1" name=""/>
+                    <pic:cNvPicPr/>
+                  </pic:nvPicPr>
+                  <pic:blipFill>
+                    <a:blip r:embed="rId23"/>
+                    <a:stretch>
+                      <a:fillRect/>
+                    </a:stretch>
+                  </pic:blipFill>
+                  <pic:spPr>
+                    <a:xfrm>
+                      <a:off x="0" y="0"/>
+                      <a:ext cx="3202726" cy="3757105"/>
+                    </a:xfrm>
+                    <a:prstGeom prst="rect">
+                      <a:avLst/>
+                    </a:prstGeom>
+                  </pic:spPr>
+                </pic:pic>
+              </a:graphicData>
+            </a:graphic>
+          </wp:inline>
+        </w:drawing>
+      </w:r>
+    </w:p>
     <w:sectPr>
-      <w:footerReference w:type="default" r:id="rId11"/>
+      <w:footerReference w:type="default" r:id="rId24"/>
       <w:pgSz w:w="11906" w:h="16838"/>
       <w:pgMar w:top="1417" w:right="1701" w:bottom="1417" w:left="1701" w:header="708" w:footer="708" w:gutter="0"/>
       <w:cols w:space="708"/>

</xml_diff>